<commit_message>
Update report cover: add full team roster (4 members)
Replaces the placeholder '(Equipo unipersonal — entrega individual)'
on the cover with the complete Equipo 18 roster:

  • Alexis Alduncin Barragán — A01017478 (already in para 6)
  • David Rodrigo Alvarado Domínguez — A01797606
  • Abraham Avila Garcia — A01795305
  • Jorge Luis Ancheyta Segovia — A01796354

Everything else preserved: confusion-matrix block (para 33), full
controller code (para 48), YouTube link still [PENDIENTE] (para 44),
filename still _SKELETON until link arrives. Docx still validates
(52 paragraphs, well-formed XML).
</commit_message>
<xml_diff>
--- a/Actividad_3.1_Deteccion_de_Peatones_Equipo18_SKELETON.docx
+++ b/Actividad_3.1_Deteccion_de_Peatones_Equipo18_SKELETON.docx
@@ -115,7 +115,15 @@
         <w:jc w:val="left"/>
       </w:pPr>
       <w:r>
-        <w:t>(Equipo unipersonal — entrega individual)</w:t>
+        <w:t>David Rodrigo Alvarado Domínguez — A01797606</w:t>
+        <w:br/>
+      </w:r>
+      <w:r>
+        <w:t>Abraham Avila Garcia — A01795305</w:t>
+        <w:br/>
+      </w:r>
+      <w:r>
+        <w:t>Jorge Luis Ancheyta Segovia — A01796354</w:t>
       </w:r>
     </w:p>
     <w:p>

</xml_diff>